<commit_message>
Deploying to gh-pages from @ d-morrison/psw@65046a0fa56407b458f1ca52ca6b052feb8d3452 🚀
</commit_message>
<xml_diff>
--- a/chapters/citations-evidence.docx
+++ b/chapters/citations-evidence.docx
@@ -15,7 +15,7 @@
         <w:pStyle w:val="Date"/>
       </w:pPr>
       <w:r>
-        <w:t xml:space="preserve">Last modified: 2026-06-20 06:44:57 (UTC)</w:t>
+        <w:t xml:space="preserve">Last modified: 2026-06-20 06:47:42 (UTC)</w:t>
       </w:r>
     </w:p>
     <w:p>
@@ -953,13 +953,13 @@
     </w:p>
     <w:bookmarkEnd w:id="21"/>
     <w:bookmarkEnd w:id="22"/>
-    <w:bookmarkStart w:id="23" w:name="best-practices"/>
+    <w:bookmarkStart w:id="23" w:name="copy-paste-with-caution"/>
     <w:p>
       <w:pPr>
         <w:pStyle w:val="Heading2"/>
       </w:pPr>
       <w:r>
-        <w:t xml:space="preserve">5 Best practices</w:t>
+        <w:t xml:space="preserve">5 Copy-paste with caution</w:t>
       </w:r>
     </w:p>
     <w:p>
@@ -967,6 +967,206 @@
         <w:pStyle w:val="FirstParagraph"/>
       </w:pPr>
       <w:r>
+        <w:t xml:space="preserve">Copying exact wording —</w:t>
+      </w:r>
+      <w:r>
+        <w:t xml:space="preserve"> </w:t>
+      </w:r>
+      <w:r>
+        <w:t xml:space="preserve">whether from another writer or from your own earlier work,</w:t>
+      </w:r>
+      <w:r>
+        <w:t xml:space="preserve"> </w:t>
+      </w:r>
+      <w:r>
+        <w:t xml:space="preserve">and even with a citation —</w:t>
+      </w:r>
+      <w:r>
+        <w:t xml:space="preserve"> </w:t>
+      </w:r>
+      <w:r>
+        <w:t xml:space="preserve">can cause problems:</w:t>
+      </w:r>
+      <w:r>
+        <w:t xml:space="preserve"> </w:t>
+      </w:r>
+      <w:r>
+        <w:t xml:space="preserve">plagiarism, if the wording is not clearly marked as a quotation,</w:t>
+      </w:r>
+      <w:r>
+        <w:t xml:space="preserve"> </w:t>
+      </w:r>
+      <w:r>
+        <w:t xml:space="preserve">and a shift in voice that makes the text harder to read.</w:t>
+      </w:r>
+    </w:p>
+    <w:p>
+      <w:pPr>
+        <w:pStyle w:val="BodyText"/>
+      </w:pPr>
+      <w:r>
+        <w:t xml:space="preserve">A few rules of thumb:</w:t>
+      </w:r>
+    </w:p>
+    <w:p>
+      <w:pPr>
+        <w:pStyle w:val="Compact"/>
+        <w:numPr>
+          <w:ilvl w:val="0"/>
+          <w:numId w:val="1010"/>
+        </w:numPr>
+      </w:pPr>
+      <w:r>
+        <w:rPr>
+          <w:b/>
+          <w:bCs/>
+        </w:rPr>
+        <w:t xml:space="preserve">Do not copy-paste prose from anyone who is not a coauthor</w:t>
+      </w:r>
+      <w:r>
+        <w:t xml:space="preserve"> </w:t>
+      </w:r>
+      <w:r>
+        <w:t xml:space="preserve">of the document you are currently writing.</w:t>
+      </w:r>
+      <w:r>
+        <w:t xml:space="preserve"> </w:t>
+      </w:r>
+      <w:r>
+        <w:t xml:space="preserve">If you must reproduce someone else’s exact words,</w:t>
+      </w:r>
+      <w:r>
+        <w:t xml:space="preserve"> </w:t>
+      </w:r>
+      <w:r>
+        <w:t xml:space="preserve">mark them as a direct quotation and cite the source.</w:t>
+      </w:r>
+    </w:p>
+    <w:p>
+      <w:pPr>
+        <w:pStyle w:val="Compact"/>
+        <w:numPr>
+          <w:ilvl w:val="0"/>
+          <w:numId w:val="1010"/>
+        </w:numPr>
+      </w:pPr>
+      <w:r>
+        <w:rPr>
+          <w:b/>
+          <w:bCs/>
+        </w:rPr>
+        <w:t xml:space="preserve">Prefer paraphrasing over quoting.</w:t>
+      </w:r>
+      <w:r>
+        <w:t xml:space="preserve"> </w:t>
+      </w:r>
+      <w:r>
+        <w:t xml:space="preserve">Restating an idea in your own words, with a citation,</w:t>
+      </w:r>
+      <w:r>
+        <w:t xml:space="preserve"> </w:t>
+      </w:r>
+      <w:r>
+        <w:t xml:space="preserve">usually reads better than a block quotation,</w:t>
+      </w:r>
+      <w:r>
+        <w:t xml:space="preserve"> </w:t>
+      </w:r>
+      <w:r>
+        <w:t xml:space="preserve">and it shows that you understand the idea.</w:t>
+      </w:r>
+    </w:p>
+    <w:p>
+      <w:pPr>
+        <w:pStyle w:val="Compact"/>
+        <w:numPr>
+          <w:ilvl w:val="0"/>
+          <w:numId w:val="1010"/>
+        </w:numPr>
+      </w:pPr>
+      <w:r>
+        <w:rPr>
+          <w:b/>
+          <w:bCs/>
+        </w:rPr>
+        <w:t xml:space="preserve">Do not recycle your own published text without thought.</w:t>
+      </w:r>
+      <w:r>
+        <w:t xml:space="preserve"> </w:t>
+      </w:r>
+      <w:r>
+        <w:t xml:space="preserve">Reusing passages from your earlier papers (self-plagiarism)</w:t>
+      </w:r>
+      <w:r>
+        <w:t xml:space="preserve"> </w:t>
+      </w:r>
+      <w:r>
+        <w:t xml:space="preserve">can violate journal policies;</w:t>
+      </w:r>
+      <w:r>
+        <w:t xml:space="preserve"> </w:t>
+      </w:r>
+      <w:r>
+        <w:t xml:space="preserve">cite the earlier work instead of repeating it.</w:t>
+      </w:r>
+    </w:p>
+    <w:p>
+      <w:pPr>
+        <w:pStyle w:val="FirstParagraph"/>
+      </w:pPr>
+      <w:r>
+        <w:t xml:space="preserve">A related case is repetition</w:t>
+      </w:r>
+      <w:r>
+        <w:t xml:space="preserve"> </w:t>
+      </w:r>
+      <w:r>
+        <w:rPr>
+          <w:i/>
+          <w:iCs/>
+        </w:rPr>
+        <w:t xml:space="preserve">within</w:t>
+      </w:r>
+      <w:r>
+        <w:t xml:space="preserve"> </w:t>
+      </w:r>
+      <w:r>
+        <w:t xml:space="preserve">your own document.</w:t>
+      </w:r>
+      <w:r>
+        <w:t xml:space="preserve"> </w:t>
+      </w:r>
+      <w:r>
+        <w:t xml:space="preserve">When a passage you are tempted to copy already appears elsewhere,</w:t>
+      </w:r>
+      <w:r>
+        <w:t xml:space="preserve"> </w:t>
+      </w:r>
+      <w:r>
+        <w:t xml:space="preserve">cross-reference it instead of repeating it:</w:t>
+      </w:r>
+      <w:r>
+        <w:t xml:space="preserve"> </w:t>
+      </w:r>
+      <w:r>
+        <w:t xml:space="preserve">this keeps a single source of truth and improves concision.</w:t>
+      </w:r>
+    </w:p>
+    <w:bookmarkEnd w:id="23"/>
+    <w:bookmarkStart w:id="24" w:name="best-practices"/>
+    <w:p>
+      <w:pPr>
+        <w:pStyle w:val="Heading2"/>
+      </w:pPr>
+      <w:r>
+        <w:t xml:space="preserve">6 Best practices</w:t>
+      </w:r>
+    </w:p>
+    <w:p>
+      <w:pPr>
+        <w:pStyle w:val="FirstParagraph"/>
+      </w:pPr>
+      <w:r>
         <w:t xml:space="preserve">To effectively support your claims:</w:t>
       </w:r>
     </w:p>
@@ -975,7 +1175,7 @@
         <w:pStyle w:val="Compact"/>
         <w:numPr>
           <w:ilvl w:val="0"/>
-          <w:numId w:val="1010"/>
+          <w:numId w:val="1011"/>
         </w:numPr>
       </w:pPr>
       <w:r>
@@ -1000,7 +1200,7 @@
         <w:pStyle w:val="Compact"/>
         <w:numPr>
           <w:ilvl w:val="0"/>
-          <w:numId w:val="1010"/>
+          <w:numId w:val="1011"/>
         </w:numPr>
       </w:pPr>
       <w:r>
@@ -1019,7 +1219,7 @@
         <w:pStyle w:val="Compact"/>
         <w:numPr>
           <w:ilvl w:val="0"/>
-          <w:numId w:val="1010"/>
+          <w:numId w:val="1011"/>
         </w:numPr>
       </w:pPr>
       <w:r>
@@ -1038,7 +1238,7 @@
         <w:pStyle w:val="Compact"/>
         <w:numPr>
           <w:ilvl w:val="0"/>
-          <w:numId w:val="1010"/>
+          <w:numId w:val="1011"/>
         </w:numPr>
       </w:pPr>
       <w:r>
@@ -1078,7 +1278,7 @@
         <w:pStyle w:val="Compact"/>
         <w:numPr>
           <w:ilvl w:val="0"/>
-          <w:numId w:val="1010"/>
+          <w:numId w:val="1011"/>
         </w:numPr>
       </w:pPr>
       <w:r>
@@ -1097,7 +1297,7 @@
         <w:pStyle w:val="Compact"/>
         <w:numPr>
           <w:ilvl w:val="0"/>
-          <w:numId w:val="1010"/>
+          <w:numId w:val="1011"/>
         </w:numPr>
       </w:pPr>
       <w:r>
@@ -1116,7 +1316,7 @@
         <w:pStyle w:val="Compact"/>
         <w:numPr>
           <w:ilvl w:val="0"/>
-          <w:numId w:val="1010"/>
+          <w:numId w:val="1011"/>
         </w:numPr>
       </w:pPr>
       <w:r>
@@ -1130,22 +1330,22 @@
         <w:t xml:space="preserve">: When possible, include work from different research groups and perspectives</w:t>
       </w:r>
     </w:p>
-    <w:bookmarkEnd w:id="23"/>
-    <w:bookmarkStart w:id="24" w:name="common-citation-errors-to-avoid"/>
+    <w:bookmarkEnd w:id="24"/>
+    <w:bookmarkStart w:id="25" w:name="common-citation-errors-to-avoid"/>
     <w:p>
       <w:pPr>
         <w:pStyle w:val="Heading2"/>
       </w:pPr>
       <w:r>
-        <w:t xml:space="preserve">6 Common citation errors to avoid</w:t>
-      </w:r>
-    </w:p>
-    <w:p>
-      <w:pPr>
-        <w:pStyle w:val="Compact"/>
-        <w:numPr>
-          <w:ilvl w:val="0"/>
-          <w:numId w:val="1011"/>
+        <w:t xml:space="preserve">7 Common citation errors to avoid</w:t>
+      </w:r>
+    </w:p>
+    <w:p>
+      <w:pPr>
+        <w:pStyle w:val="Compact"/>
+        <w:numPr>
+          <w:ilvl w:val="0"/>
+          <w:numId w:val="1012"/>
         </w:numPr>
       </w:pPr>
       <w:r>
@@ -1164,7 +1364,7 @@
         <w:pStyle w:val="Compact"/>
         <w:numPr>
           <w:ilvl w:val="0"/>
-          <w:numId w:val="1011"/>
+          <w:numId w:val="1012"/>
         </w:numPr>
       </w:pPr>
       <w:r>
@@ -1198,7 +1398,7 @@
         <w:pStyle w:val="Compact"/>
         <w:numPr>
           <w:ilvl w:val="0"/>
-          <w:numId w:val="1011"/>
+          <w:numId w:val="1012"/>
         </w:numPr>
       </w:pPr>
       <w:r>
@@ -1217,7 +1417,7 @@
         <w:pStyle w:val="Compact"/>
         <w:numPr>
           <w:ilvl w:val="0"/>
-          <w:numId w:val="1011"/>
+          <w:numId w:val="1012"/>
         </w:numPr>
       </w:pPr>
       <w:r>
@@ -1236,7 +1436,7 @@
         <w:pStyle w:val="Compact"/>
         <w:numPr>
           <w:ilvl w:val="0"/>
-          <w:numId w:val="1011"/>
+          <w:numId w:val="1012"/>
         </w:numPr>
       </w:pPr>
       <w:r>
@@ -1255,7 +1455,7 @@
         <w:pStyle w:val="Compact"/>
         <w:numPr>
           <w:ilvl w:val="0"/>
-          <w:numId w:val="1011"/>
+          <w:numId w:val="1012"/>
         </w:numPr>
       </w:pPr>
       <w:r>
@@ -1269,23 +1469,23 @@
         <w:t xml:space="preserve">: Failing to cite work that directly influenced your ideas</w:t>
       </w:r>
     </w:p>
-    <w:bookmarkEnd w:id="24"/>
-    <w:bookmarkStart w:id="30" w:name="examples"/>
+    <w:bookmarkEnd w:id="25"/>
+    <w:bookmarkStart w:id="31" w:name="examples"/>
     <w:p>
       <w:pPr>
         <w:pStyle w:val="Heading2"/>
       </w:pPr>
       <w:r>
-        <w:t xml:space="preserve">7 Examples</w:t>
-      </w:r>
-    </w:p>
-    <w:bookmarkStart w:id="25" w:name="poor-unsupported-claim"/>
+        <w:t xml:space="preserve">8 Examples</w:t>
+      </w:r>
+    </w:p>
+    <w:bookmarkStart w:id="26" w:name="poor-unsupported-claim"/>
     <w:p>
       <w:pPr>
         <w:pStyle w:val="Heading3"/>
       </w:pPr>
       <w:r>
-        <w:t xml:space="preserve">7.1 Poor (unsupported claim)</w:t>
+        <w:t xml:space="preserve">8.1 Poor (unsupported claim)</w:t>
       </w:r>
     </w:p>
     <w:p>
@@ -1311,14 +1511,14 @@
         <w:t xml:space="preserve">: This claim is stated as fact without any support.</w:t>
       </w:r>
     </w:p>
-    <w:bookmarkEnd w:id="25"/>
-    <w:bookmarkStart w:id="26" w:name="better-citation-provided"/>
+    <w:bookmarkEnd w:id="26"/>
+    <w:bookmarkStart w:id="27" w:name="better-citation-provided"/>
     <w:p>
       <w:pPr>
         <w:pStyle w:val="Heading3"/>
       </w:pPr>
       <w:r>
-        <w:t xml:space="preserve">7.2 Better (citation provided)</w:t>
+        <w:t xml:space="preserve">8.2 Better (citation provided)</w:t>
       </w:r>
     </w:p>
     <w:p>
@@ -1353,14 +1553,14 @@
         <w:t xml:space="preserve">: Citations provide evidence for the claim.</w:t>
       </w:r>
     </w:p>
-    <w:bookmarkEnd w:id="26"/>
-    <w:bookmarkStart w:id="27" w:name="best-citation-with-context"/>
+    <w:bookmarkEnd w:id="27"/>
+    <w:bookmarkStart w:id="28" w:name="best-citation-with-context"/>
     <w:p>
       <w:pPr>
         <w:pStyle w:val="Heading3"/>
       </w:pPr>
       <w:r>
-        <w:t xml:space="preserve">7.3 Best (citation with context)</w:t>
+        <w:t xml:space="preserve">8.3 Best (citation with context)</w:t>
       </w:r>
     </w:p>
     <w:p>
@@ -1407,14 +1607,14 @@
         <w:t xml:space="preserve">: The specific support each citation provides is explained.</w:t>
       </w:r>
     </w:p>
-    <w:bookmarkEnd w:id="27"/>
-    <w:bookmarkStart w:id="28" w:name="poor-irrelevant-citation"/>
+    <w:bookmarkEnd w:id="28"/>
+    <w:bookmarkStart w:id="29" w:name="poor-irrelevant-citation"/>
     <w:p>
       <w:pPr>
         <w:pStyle w:val="Heading3"/>
       </w:pPr>
       <w:r>
-        <w:t xml:space="preserve">7.4 Poor (irrelevant citation)</w:t>
+        <w:t xml:space="preserve">8.4 Poor (irrelevant citation)</w:t>
       </w:r>
     </w:p>
     <w:p>
@@ -1449,14 +1649,14 @@
         <w:t xml:space="preserve">: Knuth’s 1984 paper on literate programming doesn’t address Python or data science.</w:t>
       </w:r>
     </w:p>
-    <w:bookmarkEnd w:id="28"/>
-    <w:bookmarkStart w:id="29" w:name="better-relevant-citation"/>
+    <w:bookmarkEnd w:id="29"/>
+    <w:bookmarkStart w:id="30" w:name="better-relevant-citation"/>
     <w:p>
       <w:pPr>
         <w:pStyle w:val="Heading3"/>
       </w:pPr>
       <w:r>
-        <w:t xml:space="preserve">7.5 Better (relevant citation)</w:t>
+        <w:t xml:space="preserve">8.5 Better (relevant citation)</w:t>
       </w:r>
     </w:p>
     <w:p>
@@ -1491,15 +1691,15 @@
         <w:t xml:space="preserve">: The citation is to a current survey of programming language usage.</w:t>
       </w:r>
     </w:p>
-    <w:bookmarkEnd w:id="29"/>
     <w:bookmarkEnd w:id="30"/>
-    <w:bookmarkStart w:id="40" w:name="conclusion"/>
+    <w:bookmarkEnd w:id="31"/>
+    <w:bookmarkStart w:id="41" w:name="conclusion"/>
     <w:p>
       <w:pPr>
         <w:pStyle w:val="Heading2"/>
       </w:pPr>
       <w:r>
-        <w:t xml:space="preserve">8 Conclusion</w:t>
+        <w:t xml:space="preserve">9 Conclusion</w:t>
       </w:r>
     </w:p>
     <w:p>
@@ -1552,8 +1752,8 @@
         <w:t xml:space="preserve">add a citation or present direct evidence.</w:t>
       </w:r>
     </w:p>
-    <w:bookmarkStart w:id="39" w:name="refs"/>
-    <w:bookmarkStart w:id="32" w:name="ref-hawkins2004"/>
+    <w:bookmarkStart w:id="40" w:name="refs"/>
+    <w:bookmarkStart w:id="33" w:name="ref-hawkins2004"/>
     <w:p>
       <w:pPr>
         <w:pStyle w:val="Bibliography"/>
@@ -1586,7 +1786,7 @@
       <w:r>
         <w:t xml:space="preserve"> </w:t>
       </w:r>
-      <w:hyperlink r:id="rId31">
+      <w:hyperlink r:id="rId32">
         <w:r>
           <w:rPr>
             <w:rStyle w:val="Hyperlink"/>
@@ -1598,8 +1798,8 @@
         <w:t xml:space="preserve">.</w:t>
       </w:r>
     </w:p>
-    <w:bookmarkEnd w:id="32"/>
-    <w:bookmarkStart w:id="34" w:name="ref-knuth84"/>
+    <w:bookmarkEnd w:id="33"/>
+    <w:bookmarkStart w:id="35" w:name="ref-knuth84"/>
     <w:p>
       <w:pPr>
         <w:pStyle w:val="Bibliography"/>
@@ -1632,7 +1832,7 @@
       <w:r>
         <w:t xml:space="preserve"> </w:t>
       </w:r>
-      <w:hyperlink r:id="rId33">
+      <w:hyperlink r:id="rId34">
         <w:r>
           <w:rPr>
             <w:rStyle w:val="Hyperlink"/>
@@ -1644,8 +1844,8 @@
         <w:t xml:space="preserve">.</w:t>
       </w:r>
     </w:p>
-    <w:bookmarkEnd w:id="34"/>
-    <w:bookmarkStart w:id="36" w:name="ref-stackoverflow2024"/>
+    <w:bookmarkEnd w:id="35"/>
+    <w:bookmarkStart w:id="37" w:name="ref-stackoverflow2024"/>
     <w:p>
       <w:pPr>
         <w:pStyle w:val="Bibliography"/>
@@ -1669,7 +1869,7 @@
       <w:r>
         <w:t xml:space="preserve"> </w:t>
       </w:r>
-      <w:hyperlink r:id="rId35">
+      <w:hyperlink r:id="rId36">
         <w:r>
           <w:rPr>
             <w:rStyle w:val="Hyperlink"/>
@@ -1681,8 +1881,8 @@
         <w:t xml:space="preserve">.</w:t>
       </w:r>
     </w:p>
-    <w:bookmarkEnd w:id="36"/>
-    <w:bookmarkStart w:id="38" w:name="ref-vapnik1998"/>
+    <w:bookmarkEnd w:id="37"/>
+    <w:bookmarkStart w:id="39" w:name="ref-vapnik1998"/>
     <w:p>
       <w:pPr>
         <w:pStyle w:val="Bibliography"/>
@@ -1706,7 +1906,7 @@
       <w:r>
         <w:t xml:space="preserve"> </w:t>
       </w:r>
-      <w:hyperlink r:id="rId37">
+      <w:hyperlink r:id="rId38">
         <w:r>
           <w:rPr>
             <w:rStyle w:val="Hyperlink"/>
@@ -1718,9 +1918,9 @@
         <w:t xml:space="preserve">.</w:t>
       </w:r>
     </w:p>
-    <w:bookmarkEnd w:id="38"/>
     <w:bookmarkEnd w:id="39"/>
     <w:bookmarkEnd w:id="40"/>
+    <w:bookmarkEnd w:id="41"/>
     <w:sectPr>
       <w:footnotePr>
         <w:numRestart w:val="eachSect"/>
@@ -2050,6 +2250,9 @@
     <w:abstractNumId w:val="991"/>
   </w:num>
   <w:num w:numId="1010">
+    <w:abstractNumId w:val="991"/>
+  </w:num>
+  <w:num w:numId="1011">
     <w:abstractNumId w:val="99411"/>
     <w:lvlOverride w:ilvl="0">
       <w:startOverride w:val="1"/>
@@ -2079,7 +2282,7 @@
       <w:startOverride w:val="1"/>
     </w:lvlOverride>
   </w:num>
-  <w:num w:numId="1011">
+  <w:num w:numId="1012">
     <w:abstractNumId w:val="991"/>
   </w:num>
 </w:numbering>

</xml_diff>